<commit_message>
fix: consolidate fragmented Jinja2 tags in Word report template
Replace {% p if/else/endif %} and {% tr for/endfor %} prefixed tags with
standard Jinja2 syntax by consolidating XML runs fragmented by Word's
proofErr spell/grammar markers into single clean run elements.

Co-authored-by: chessmatt-maker <299691206+chessmatt-maker@users.noreply.github.com>
</commit_message>
<xml_diff>
--- a/templates/report_template.docx
+++ b/templates/report_template.docx
@@ -371,70 +371,15 @@
           <w:kern w:val="0"/>
           <w14:ligatures w14:val="none"/>
         </w:rPr>
-        <w:t xml:space="preserve">{% p if </w:t>
-      </w:r>
-      <w:proofErr w:type="spellStart"/>
-      <w:r>
-        <w:rPr>
-          <w:rFonts w:ascii="Times New Roman" w:eastAsia="Times New Roman" w:hAnsi="Times New Roman" w:cs="Times New Roman"/>
-          <w:kern w:val="0"/>
-          <w14:ligatures w14:val="none"/>
-        </w:rPr>
-        <w:t>has_high_</w:t>
-      </w:r>
-      <w:proofErr w:type="gramStart"/>
-      <w:r>
-        <w:rPr>
-          <w:rFonts w:ascii="Times New Roman" w:eastAsia="Times New Roman" w:hAnsi="Times New Roman" w:cs="Times New Roman"/>
-          <w:kern w:val="0"/>
-          <w14:ligatures w14:val="none"/>
-        </w:rPr>
-        <w:t>confidence</w:t>
-      </w:r>
-      <w:proofErr w:type="spellEnd"/>
-      <w:r>
-        <w:rPr>
-          <w:rFonts w:ascii="Times New Roman" w:eastAsia="Times New Roman" w:hAnsi="Times New Roman" w:cs="Times New Roman"/>
-          <w:kern w:val="0"/>
-          <w14:ligatures w14:val="none"/>
-        </w:rPr>
-        <w:t xml:space="preserve"> %} {</w:t>
-      </w:r>
-      <w:proofErr w:type="gramEnd"/>
-      <w:r>
-        <w:rPr>
-          <w:rFonts w:ascii="Times New Roman" w:eastAsia="Times New Roman" w:hAnsi="Times New Roman" w:cs="Times New Roman"/>
-          <w:kern w:val="0"/>
-          <w14:ligatures w14:val="none"/>
-        </w:rPr>
-        <w:t xml:space="preserve">% tr for finding in </w:t>
-      </w:r>
-      <w:proofErr w:type="spellStart"/>
-      <w:r>
-        <w:rPr>
-          <w:rFonts w:ascii="Times New Roman" w:eastAsia="Times New Roman" w:hAnsi="Times New Roman" w:cs="Times New Roman"/>
-          <w:kern w:val="0"/>
-          <w14:ligatures w14:val="none"/>
-        </w:rPr>
-        <w:t>high_confidence_</w:t>
-      </w:r>
-      <w:proofErr w:type="gramStart"/>
-      <w:r>
-        <w:rPr>
-          <w:rFonts w:ascii="Times New Roman" w:eastAsia="Times New Roman" w:hAnsi="Times New Roman" w:cs="Times New Roman"/>
-          <w:kern w:val="0"/>
-          <w14:ligatures w14:val="none"/>
-        </w:rPr>
-        <w:t>findings</w:t>
-      </w:r>
-      <w:proofErr w:type="spellEnd"/>
-      <w:r>
-        <w:rPr>
-          <w:rFonts w:ascii="Times New Roman" w:eastAsia="Times New Roman" w:hAnsi="Times New Roman" w:cs="Times New Roman"/>
-          <w:kern w:val="0"/>
-          <w14:ligatures w14:val="none"/>
-        </w:rPr>
-        <w:t xml:space="preserve"> %}</w:t>
+        <w:t xml:space="preserve">{% if has_high_confidence %}</w:t>
+      </w:r>
+      <w:r>
+        <w:rPr>
+          <w:rFonts w:ascii="Times New Roman" w:eastAsia="Times New Roman" w:hAnsi="Times New Roman" w:cs="Times New Roman"/>
+          <w:kern w:val="0"/>
+          <w14:ligatures w14:val="none"/>
+        </w:rPr>
+        <w:t xml:space="preserve">{% for finding in high_confidence_findings %}</w:t>
       </w:r>
       <w:proofErr w:type="gramEnd"/>
     </w:p>
@@ -755,26 +700,15 @@
           <w:kern w:val="0"/>
           <w14:ligatures w14:val="none"/>
         </w:rPr>
-        <w:t xml:space="preserve">{% tr </w:t>
-      </w:r>
-      <w:proofErr w:type="spellStart"/>
-      <w:proofErr w:type="gramStart"/>
-      <w:r>
-        <w:rPr>
-          <w:rFonts w:ascii="Times New Roman" w:eastAsia="Times New Roman" w:hAnsi="Times New Roman" w:cs="Times New Roman"/>
-          <w:kern w:val="0"/>
-          <w14:ligatures w14:val="none"/>
-        </w:rPr>
-        <w:t>endfor</w:t>
-      </w:r>
-      <w:proofErr w:type="spellEnd"/>
-      <w:r>
-        <w:rPr>
-          <w:rFonts w:ascii="Times New Roman" w:eastAsia="Times New Roman" w:hAnsi="Times New Roman" w:cs="Times New Roman"/>
-          <w:kern w:val="0"/>
-          <w14:ligatures w14:val="none"/>
-        </w:rPr>
-        <w:t xml:space="preserve"> %} {</w:t>
+        <w:t xml:space="preserve">{% endfor %}</w:t>
+      </w:r>
+      <w:r>
+        <w:rPr>
+          <w:rFonts w:ascii="Times New Roman" w:eastAsia="Times New Roman" w:hAnsi="Times New Roman" w:cs="Times New Roman"/>
+          <w:kern w:val="0"/>
+          <w14:ligatures w14:val="none"/>
+        </w:rPr>
+        <w:t xml:space="preserve">{% else %}</w:t>
       </w:r>
       <w:proofErr w:type="gramEnd"/>
       <w:r>
@@ -783,34 +717,7 @@
           <w:kern w:val="0"/>
           <w14:ligatures w14:val="none"/>
         </w:rPr>
-        <w:t xml:space="preserve">% p </w:t>
-      </w:r>
-      <w:proofErr w:type="gramStart"/>
-      <w:r>
-        <w:rPr>
-          <w:rFonts w:ascii="Times New Roman" w:eastAsia="Times New Roman" w:hAnsi="Times New Roman" w:cs="Times New Roman"/>
-          <w:kern w:val="0"/>
-          <w14:ligatures w14:val="none"/>
-        </w:rPr>
-        <w:t>else %}</w:t>
-      </w:r>
-      <w:proofErr w:type="gramEnd"/>
-      <w:r>
-        <w:rPr>
-          <w:rFonts w:ascii="Times New Roman" w:eastAsia="Times New Roman" w:hAnsi="Times New Roman" w:cs="Times New Roman"/>
-          <w:kern w:val="0"/>
-          <w14:ligatures w14:val="none"/>
-        </w:rPr>
-        <w:t xml:space="preserve"> No high-confidence findings were identified during this scan. {% p </w:t>
-      </w:r>
-      <w:proofErr w:type="gramStart"/>
-      <w:r>
-        <w:rPr>
-          <w:rFonts w:ascii="Times New Roman" w:eastAsia="Times New Roman" w:hAnsi="Times New Roman" w:cs="Times New Roman"/>
-          <w:kern w:val="0"/>
-          <w14:ligatures w14:val="none"/>
-        </w:rPr>
-        <w:t>endif %}</w:t>
+        <w:t xml:space="preserve"> No high-confidence findings were identified during this scan. {% endif %}</w:t>
       </w:r>
       <w:proofErr w:type="gramEnd"/>
     </w:p>
@@ -872,70 +779,15 @@
           <w:kern w:val="0"/>
           <w14:ligatures w14:val="none"/>
         </w:rPr>
-        <w:t xml:space="preserve"> {% p if </w:t>
-      </w:r>
-      <w:proofErr w:type="spellStart"/>
-      <w:r>
-        <w:rPr>
-          <w:rFonts w:ascii="Times New Roman" w:eastAsia="Times New Roman" w:hAnsi="Times New Roman" w:cs="Times New Roman"/>
-          <w:kern w:val="0"/>
-          <w14:ligatures w14:val="none"/>
-        </w:rPr>
-        <w:t>has_</w:t>
-      </w:r>
-      <w:proofErr w:type="gramStart"/>
-      <w:r>
-        <w:rPr>
-          <w:rFonts w:ascii="Times New Roman" w:eastAsia="Times New Roman" w:hAnsi="Times New Roman" w:cs="Times New Roman"/>
-          <w:kern w:val="0"/>
-          <w14:ligatures w14:val="none"/>
-        </w:rPr>
-        <w:t>dubious</w:t>
-      </w:r>
-      <w:proofErr w:type="spellEnd"/>
-      <w:r>
-        <w:rPr>
-          <w:rFonts w:ascii="Times New Roman" w:eastAsia="Times New Roman" w:hAnsi="Times New Roman" w:cs="Times New Roman"/>
-          <w:kern w:val="0"/>
-          <w14:ligatures w14:val="none"/>
-        </w:rPr>
-        <w:t xml:space="preserve"> %} {</w:t>
-      </w:r>
-      <w:proofErr w:type="gramEnd"/>
-      <w:r>
-        <w:rPr>
-          <w:rFonts w:ascii="Times New Roman" w:eastAsia="Times New Roman" w:hAnsi="Times New Roman" w:cs="Times New Roman"/>
-          <w:kern w:val="0"/>
-          <w14:ligatures w14:val="none"/>
-        </w:rPr>
-        <w:t xml:space="preserve">% tr for finding in </w:t>
-      </w:r>
-      <w:proofErr w:type="spellStart"/>
-      <w:r>
-        <w:rPr>
-          <w:rFonts w:ascii="Times New Roman" w:eastAsia="Times New Roman" w:hAnsi="Times New Roman" w:cs="Times New Roman"/>
-          <w:kern w:val="0"/>
-          <w14:ligatures w14:val="none"/>
-        </w:rPr>
-        <w:t>dubious_</w:t>
-      </w:r>
-      <w:proofErr w:type="gramStart"/>
-      <w:r>
-        <w:rPr>
-          <w:rFonts w:ascii="Times New Roman" w:eastAsia="Times New Roman" w:hAnsi="Times New Roman" w:cs="Times New Roman"/>
-          <w:kern w:val="0"/>
-          <w14:ligatures w14:val="none"/>
-        </w:rPr>
-        <w:t>findings</w:t>
-      </w:r>
-      <w:proofErr w:type="spellEnd"/>
-      <w:r>
-        <w:rPr>
-          <w:rFonts w:ascii="Times New Roman" w:eastAsia="Times New Roman" w:hAnsi="Times New Roman" w:cs="Times New Roman"/>
-          <w:kern w:val="0"/>
-          <w14:ligatures w14:val="none"/>
-        </w:rPr>
-        <w:t xml:space="preserve"> %}</w:t>
+        <w:t xml:space="preserve"> {% if has_dubious %}</w:t>
+      </w:r>
+      <w:r>
+        <w:rPr>
+          <w:rFonts w:ascii="Times New Roman" w:eastAsia="Times New Roman" w:hAnsi="Times New Roman" w:cs="Times New Roman"/>
+          <w:kern w:val="0"/>
+          <w14:ligatures w14:val="none"/>
+        </w:rPr>
+        <w:t xml:space="preserve">{% for finding in dubious_findings %}</w:t>
       </w:r>
       <w:proofErr w:type="gramEnd"/>
     </w:p>
@@ -1178,26 +1030,15 @@
           <w:kern w:val="0"/>
           <w14:ligatures w14:val="none"/>
         </w:rPr>
-        <w:t xml:space="preserve">{% tr </w:t>
-      </w:r>
-      <w:proofErr w:type="spellStart"/>
-      <w:proofErr w:type="gramStart"/>
-      <w:r>
-        <w:rPr>
-          <w:rFonts w:ascii="Times New Roman" w:eastAsia="Times New Roman" w:hAnsi="Times New Roman" w:cs="Times New Roman"/>
-          <w:kern w:val="0"/>
-          <w14:ligatures w14:val="none"/>
-        </w:rPr>
-        <w:t>endfor</w:t>
-      </w:r>
-      <w:proofErr w:type="spellEnd"/>
-      <w:r>
-        <w:rPr>
-          <w:rFonts w:ascii="Times New Roman" w:eastAsia="Times New Roman" w:hAnsi="Times New Roman" w:cs="Times New Roman"/>
-          <w:kern w:val="0"/>
-          <w14:ligatures w14:val="none"/>
-        </w:rPr>
-        <w:t xml:space="preserve"> %} {</w:t>
+        <w:t xml:space="preserve">{% endfor %}</w:t>
+      </w:r>
+      <w:r>
+        <w:rPr>
+          <w:rFonts w:ascii="Times New Roman" w:eastAsia="Times New Roman" w:hAnsi="Times New Roman" w:cs="Times New Roman"/>
+          <w:kern w:val="0"/>
+          <w14:ligatures w14:val="none"/>
+        </w:rPr>
+        <w:t xml:space="preserve">{% else %}</w:t>
       </w:r>
       <w:proofErr w:type="gramEnd"/>
       <w:r>
@@ -1206,34 +1047,7 @@
           <w:kern w:val="0"/>
           <w14:ligatures w14:val="none"/>
         </w:rPr>
-        <w:t xml:space="preserve">% p </w:t>
-      </w:r>
-      <w:proofErr w:type="gramStart"/>
-      <w:r>
-        <w:rPr>
-          <w:rFonts w:ascii="Times New Roman" w:eastAsia="Times New Roman" w:hAnsi="Times New Roman" w:cs="Times New Roman"/>
-          <w:kern w:val="0"/>
-          <w14:ligatures w14:val="none"/>
-        </w:rPr>
-        <w:t>else %}</w:t>
-      </w:r>
-      <w:proofErr w:type="gramEnd"/>
-      <w:r>
-        <w:rPr>
-          <w:rFonts w:ascii="Times New Roman" w:eastAsia="Times New Roman" w:hAnsi="Times New Roman" w:cs="Times New Roman"/>
-          <w:kern w:val="0"/>
-          <w14:ligatures w14:val="none"/>
-        </w:rPr>
-        <w:t xml:space="preserve"> No dubious findings were identified. {% p </w:t>
-      </w:r>
-      <w:proofErr w:type="gramStart"/>
-      <w:r>
-        <w:rPr>
-          <w:rFonts w:ascii="Times New Roman" w:eastAsia="Times New Roman" w:hAnsi="Times New Roman" w:cs="Times New Roman"/>
-          <w:kern w:val="0"/>
-          <w14:ligatures w14:val="none"/>
-        </w:rPr>
-        <w:t>endif %}</w:t>
+        <w:t xml:space="preserve"> No dubious findings were identified. {% endif %}</w:t>
       </w:r>
       <w:proofErr w:type="gramEnd"/>
     </w:p>
@@ -1418,26 +1232,7 @@
           <w:kern w:val="0"/>
           <w14:ligatures w14:val="none"/>
         </w:rPr>
-        <w:t xml:space="preserve">{% tr </w:t>
-      </w:r>
-      <w:proofErr w:type="spellStart"/>
-      <w:proofErr w:type="gramStart"/>
-      <w:r>
-        <w:rPr>
-          <w:rFonts w:ascii="Times New Roman" w:eastAsia="Times New Roman" w:hAnsi="Times New Roman" w:cs="Times New Roman"/>
-          <w:kern w:val="0"/>
-          <w14:ligatures w14:val="none"/>
-        </w:rPr>
-        <w:t>endfor</w:t>
-      </w:r>
-      <w:proofErr w:type="spellEnd"/>
-      <w:r>
-        <w:rPr>
-          <w:rFonts w:ascii="Times New Roman" w:eastAsia="Times New Roman" w:hAnsi="Times New Roman" w:cs="Times New Roman"/>
-          <w:kern w:val="0"/>
-          <w14:ligatures w14:val="none"/>
-        </w:rPr>
-        <w:t xml:space="preserve"> %}</w:t>
+        <w:t xml:space="preserve">{% endfor %}</w:t>
       </w:r>
       <w:proofErr w:type="gramEnd"/>
     </w:p>

</xml_diff>

<commit_message>
Fix Jinja2 TemplateSyntaxError in report_template.docx: add missing for loop and fix split tag
Co-authored-by: chessmatt-maker <299691206+chessmatt-maker@users.noreply.github.com>
</commit_message>
<xml_diff>
--- a/templates/report_template.docx
+++ b/templates/report_template.docx
@@ -1116,6 +1116,23 @@
     </w:p>
     <w:p>
       <w:pPr>
+        <w:rPr>
+          <w:rFonts w:ascii="Times New Roman" w:eastAsia="Times New Roman" w:hAnsi="Times New Roman" w:cs="Times New Roman"/>
+          <w:kern w:val="0"/>
+          <w14:ligatures w14:val="none"/>
+        </w:rPr>
+      </w:pPr>
+      <w:r>
+        <w:rPr>
+          <w:rFonts w:ascii="Times New Roman" w:eastAsia="Times New Roman" w:hAnsi="Times New Roman" w:cs="Times New Roman"/>
+          <w:kern w:val="0"/>
+          <w14:ligatures w14:val="none"/>
+        </w:rPr>
+        <w:t xml:space="preserve">{% for dork in google_dorks %}</w:t>
+      </w:r>
+    </w:p>
+    <w:p>
+      <w:pPr>
         <w:pBdr>
           <w:top w:val="single" w:sz="8" w:space="6" w:color="B7D4E8"/>
           <w:left w:val="single" w:sz="8" w:space="6" w:color="B7D4E8"/>
@@ -1150,16 +1167,7 @@
           <w:kern w:val="0"/>
           <w14:ligatures w14:val="none"/>
         </w:rPr>
-        <w:t>{{ dork</w:t>
-      </w:r>
-      <w:proofErr w:type="gramEnd"/>
-      <w:r>
-        <w:rPr>
-          <w:rFonts w:ascii="Times New Roman" w:eastAsia="Times New Roman" w:hAnsi="Times New Roman" w:cs="Times New Roman"/>
-          <w:kern w:val="0"/>
-          <w14:ligatures w14:val="none"/>
-        </w:rPr>
-        <w:t xml:space="preserve"> }}</w:t>
+        <w:t xml:space="preserve">{{ dork }}</w:t>
       </w:r>
     </w:p>
     <w:p>

</xml_diff>

<commit_message>
Fix TemplateSyntaxError: rewrite report_gen.py with python-docx, clean template
Co-authored-by: chessmatt-maker <299691206+chessmatt-maker@users.noreply.github.com>
</commit_message>
<xml_diff>
--- a/templates/report_template.docx
+++ b/templates/report_template.docx
@@ -359,30 +359,6 @@
         <w:t>CONFIRMED &amp; HIGH-CONFIDENCE LEADS (Tier 1 &amp; 2)</w:t>
       </w:r>
     </w:p>
-    <w:p>
-      <w:pPr>
-        <w:rPr>
-          <w:color w:val="4B5563"/>
-        </w:rPr>
-      </w:pPr>
-      <w:r>
-        <w:rPr>
-          <w:rFonts w:ascii="Times New Roman" w:eastAsia="Times New Roman" w:hAnsi="Times New Roman" w:cs="Times New Roman"/>
-          <w:kern w:val="0"/>
-          <w14:ligatures w14:val="none"/>
-        </w:rPr>
-        <w:t xml:space="preserve">{% if has_high_confidence %}</w:t>
-      </w:r>
-      <w:r>
-        <w:rPr>
-          <w:rFonts w:ascii="Times New Roman" w:eastAsia="Times New Roman" w:hAnsi="Times New Roman" w:cs="Times New Roman"/>
-          <w:kern w:val="0"/>
-          <w14:ligatures w14:val="none"/>
-        </w:rPr>
-        <w:t xml:space="preserve">{% for finding in high_confidence_findings %}</w:t>
-      </w:r>
-      <w:proofErr w:type="gramEnd"/>
-    </w:p>
     <w:tbl>
       <w:tblPr>
         <w:tblStyle w:val="GridTable4-Accent1"/>
@@ -687,40 +663,6 @@
         </w:tc>
       </w:tr>
     </w:tbl>
-    <w:p/>
-    <w:p>
-      <w:pPr>
-        <w:rPr>
-          <w:color w:val="4B5563"/>
-        </w:rPr>
-      </w:pPr>
-      <w:r>
-        <w:rPr>
-          <w:rFonts w:ascii="Times New Roman" w:eastAsia="Times New Roman" w:hAnsi="Times New Roman" w:cs="Times New Roman"/>
-          <w:kern w:val="0"/>
-          <w14:ligatures w14:val="none"/>
-        </w:rPr>
-        <w:t xml:space="preserve">{% endfor %}</w:t>
-      </w:r>
-      <w:r>
-        <w:rPr>
-          <w:rFonts w:ascii="Times New Roman" w:eastAsia="Times New Roman" w:hAnsi="Times New Roman" w:cs="Times New Roman"/>
-          <w:kern w:val="0"/>
-          <w14:ligatures w14:val="none"/>
-        </w:rPr>
-        <w:t xml:space="preserve">{% else %}</w:t>
-      </w:r>
-      <w:proofErr w:type="gramEnd"/>
-      <w:r>
-        <w:rPr>
-          <w:rFonts w:ascii="Times New Roman" w:eastAsia="Times New Roman" w:hAnsi="Times New Roman" w:cs="Times New Roman"/>
-          <w:kern w:val="0"/>
-          <w14:ligatures w14:val="none"/>
-        </w:rPr>
-        <w:t xml:space="preserve"> No high-confidence findings were identified during this scan. {% endif %}</w:t>
-      </w:r>
-      <w:proofErr w:type="gramEnd"/>
-    </w:p>
     <w:p>
       <w:pPr>
         <w:pStyle w:val="Heading2"/>
@@ -763,33 +705,10 @@
         </w:pBdr>
         <w:shd w:val="clear" w:color="auto" w:fill="FFF8E5"/>
       </w:pPr>
+      <w:proofErr w:type="gramEnd"/>
       <w:r>
-        <w:rPr>
-          <w:rFonts w:ascii="Times New Roman" w:eastAsia="Times New Roman" w:hAnsi="Times New Roman" w:cs="Times New Roman"/>
-          <w:i/>
-          <w:iCs/>
-          <w:kern w:val="0"/>
-          <w14:ligatures w14:val="none"/>
-        </w:rPr>
         <w:t>Note: The following leads lack secondary corroboration and require manual verification before being used in litigation.</w:t>
       </w:r>
-      <w:r>
-        <w:rPr>
-          <w:rFonts w:ascii="Times New Roman" w:eastAsia="Times New Roman" w:hAnsi="Times New Roman" w:cs="Times New Roman"/>
-          <w:kern w:val="0"/>
-          <w14:ligatures w14:val="none"/>
-        </w:rPr>
-        <w:t xml:space="preserve"> {% if has_dubious %}</w:t>
-      </w:r>
-      <w:r>
-        <w:rPr>
-          <w:rFonts w:ascii="Times New Roman" w:eastAsia="Times New Roman" w:hAnsi="Times New Roman" w:cs="Times New Roman"/>
-          <w:kern w:val="0"/>
-          <w14:ligatures w14:val="none"/>
-        </w:rPr>
-        <w:t xml:space="preserve">{% for finding in dubious_findings %}</w:t>
-      </w:r>
-      <w:proofErr w:type="gramEnd"/>
     </w:p>
     <w:tbl>
       <w:tblPr>
@@ -1017,40 +936,6 @@
         </w:tc>
       </w:tr>
     </w:tbl>
-    <w:p/>
-    <w:p>
-      <w:pPr>
-        <w:rPr>
-          <w:color w:val="4B5563"/>
-        </w:rPr>
-      </w:pPr>
-      <w:r>
-        <w:rPr>
-          <w:rFonts w:ascii="Times New Roman" w:eastAsia="Times New Roman" w:hAnsi="Times New Roman" w:cs="Times New Roman"/>
-          <w:kern w:val="0"/>
-          <w14:ligatures w14:val="none"/>
-        </w:rPr>
-        <w:t xml:space="preserve">{% endfor %}</w:t>
-      </w:r>
-      <w:r>
-        <w:rPr>
-          <w:rFonts w:ascii="Times New Roman" w:eastAsia="Times New Roman" w:hAnsi="Times New Roman" w:cs="Times New Roman"/>
-          <w:kern w:val="0"/>
-          <w14:ligatures w14:val="none"/>
-        </w:rPr>
-        <w:t xml:space="preserve">{% else %}</w:t>
-      </w:r>
-      <w:proofErr w:type="gramEnd"/>
-      <w:r>
-        <w:rPr>
-          <w:rFonts w:ascii="Times New Roman" w:eastAsia="Times New Roman" w:hAnsi="Times New Roman" w:cs="Times New Roman"/>
-          <w:kern w:val="0"/>
-          <w14:ligatures w14:val="none"/>
-        </w:rPr>
-        <w:t xml:space="preserve"> No dubious findings were identified. {% endif %}</w:t>
-      </w:r>
-      <w:proofErr w:type="gramEnd"/>
-    </w:p>
     <w:p>
       <w:pPr>
         <w:pStyle w:val="Heading2"/>
@@ -1220,22 +1105,6 @@
       <w:proofErr w:type="gramEnd"/>
     </w:p>
     <w:p/>
-    <w:p>
-      <w:pPr>
-        <w:rPr>
-          <w:color w:val="4B5563"/>
-        </w:rPr>
-      </w:pPr>
-      <w:r>
-        <w:rPr>
-          <w:rFonts w:ascii="Times New Roman" w:eastAsia="Times New Roman" w:hAnsi="Times New Roman" w:cs="Times New Roman"/>
-          <w:kern w:val="0"/>
-          <w14:ligatures w14:val="none"/>
-        </w:rPr>
-        <w:t xml:space="preserve">{% endfor %}</w:t>
-      </w:r>
-      <w:proofErr w:type="gramEnd"/>
-    </w:p>
     <w:p/>
     <w:sectPr>
       <w:pgSz w:w="12240" w:h="15840"/>

</xml_diff>